<commit_message>
docs: add candidate Himanshu Goyal and academic details to project report and cover page
</commit_message>
<xml_diff>
--- a/MLOps_Project_Report.docx
+++ b/MLOps_Project_Report.docx
@@ -4,42 +4,409 @@
   <w:body>
     <w:p>
       <w:pPr>
-        <w:spacing w:before="240" w:after="80"/>
+        <w:spacing w:before="160" w:after="40"/>
+        <w:jc w:val="center"/>
+      </w:pPr>
+      <w:r>
+        <w:rPr>
+          <w:rFonts w:ascii="Calibri" w:hAnsi="Calibri"/>
+          <w:b/>
+          <w:color w:val="2563EB"/>
+          <w:sz w:val="26"/>
+        </w:rPr>
+        <w:t>APEX INSTITUTE OF TECHNOLOGY (AIT)</w:t>
+        <w:br/>
+        <w:t>DEPARTMENT OF COMPUTER SCIENCE &amp; ENGINEERING</w:t>
+      </w:r>
+    </w:p>
+    <w:p>
+      <w:pPr>
+        <w:spacing w:before="80" w:after="440"/>
+        <w:jc w:val="center"/>
+      </w:pPr>
+      <w:r>
+        <w:rPr>
+          <w:rFonts w:ascii="Calibri" w:hAnsi="Calibri"/>
+          <w:b/>
+          <w:color w:val="334155"/>
+          <w:sz w:val="22"/>
+        </w:rPr>
+        <w:t>DATA ENGINEERING II ― CAPSTONE PROJECT REPORT</w:t>
+      </w:r>
+    </w:p>
+    <w:p>
+      <w:pPr>
+        <w:spacing w:before="240" w:after="160"/>
+        <w:jc w:val="center"/>
       </w:pPr>
       <w:r>
         <w:rPr>
           <w:rFonts w:ascii="Calibri" w:hAnsi="Calibri"/>
           <w:b/>
           <w:color w:val="1E3A8A"/>
-          <w:sz w:val="52"/>
+          <w:sz w:val="44"/>
         </w:rPr>
-        <w:t>MLOps Engineering &amp; Observability Report</w:t>
+        <w:t>End-to-End MLOps Pipeline: Automated Model Deployment, Containerization with Kubernetes, &amp; Real-Time Observability</w:t>
       </w:r>
     </w:p>
     <w:p>
       <w:pPr>
-        <w:spacing w:after="360"/>
+        <w:spacing w:after="480"/>
+        <w:jc w:val="center"/>
       </w:pPr>
       <w:r>
         <w:rPr>
           <w:rFonts w:ascii="Calibri" w:hAnsi="Calibri"/>
           <w:i/>
           <w:color w:val="334155"/>
-          <w:sz w:val="26"/>
+          <w:sz w:val="23"/>
         </w:rPr>
-        <w:t>Automated Model Deployment, Kubernetes Containerization, and Real-Time Statistical Drift Detection</w:t>
+        <w:t>Credit Default Risk Prediction • Kolmogorov-Smirnov &amp; PSI Drift Engine • Prometheus &amp; Grafana Telemetry</w:t>
       </w:r>
     </w:p>
+    <w:tbl>
+      <w:tblPr>
+        <w:tblW w:type="auto" w:w="0"/>
+        <w:jc w:val="center"/>
+        <w:tblLook w:firstColumn="1" w:firstRow="1" w:lastColumn="0" w:lastRow="0" w:noHBand="0" w:noVBand="1" w:val="04A0"/>
+      </w:tblPr>
+      <w:tblGrid>
+        <w:gridCol w:w="4680"/>
+        <w:gridCol w:w="4680"/>
+      </w:tblGrid>
+      <w:tr>
+        <w:tc>
+          <w:tcPr>
+            <w:tcW w:type="dxa" w:w="3600"/>
+            <w:shd w:fill="1E3A8A"/>
+            <w:tcMar>
+              <w:top w:w="90" w:type="dxa"/>
+              <w:bottom w:w="90" w:type="dxa"/>
+              <w:left w:w="140" w:type="dxa"/>
+              <w:right w:w="140" w:type="dxa"/>
+            </w:tcMar>
+          </w:tcPr>
+          <w:p>
+            <w:pPr>
+              <w:spacing w:before="40" w:after="40"/>
+            </w:pPr>
+            <w:r>
+              <w:rPr>
+                <w:rFonts w:ascii="Calibri" w:hAnsi="Calibri"/>
+                <w:b/>
+                <w:color w:val="FFFFFF"/>
+                <w:sz w:val="20"/>
+              </w:rPr>
+              <w:t>Student Name</w:t>
+            </w:r>
+          </w:p>
+        </w:tc>
+        <w:tc>
+          <w:tcPr>
+            <w:tcW w:type="dxa" w:w="5760"/>
+            <w:shd w:fill="2563EB"/>
+            <w:tcMar>
+              <w:top w:w="90" w:type="dxa"/>
+              <w:bottom w:w="90" w:type="dxa"/>
+              <w:left w:w="140" w:type="dxa"/>
+              <w:right w:w="140" w:type="dxa"/>
+            </w:tcMar>
+          </w:tcPr>
+          <w:p>
+            <w:pPr>
+              <w:spacing w:before="40" w:after="40"/>
+            </w:pPr>
+            <w:r>
+              <w:rPr>
+                <w:rFonts w:ascii="Calibri" w:hAnsi="Calibri"/>
+                <w:b/>
+                <w:color w:val="FFFFFF"/>
+                <w:sz w:val="20"/>
+              </w:rPr>
+              <w:t>HIMANSHU GOYAL</w:t>
+            </w:r>
+          </w:p>
+        </w:tc>
+      </w:tr>
+      <w:tr>
+        <w:tc>
+          <w:tcPr>
+            <w:tcW w:type="dxa" w:w="3600"/>
+            <w:shd w:fill="F1F5F9"/>
+            <w:tcMar>
+              <w:top w:w="90" w:type="dxa"/>
+              <w:bottom w:w="90" w:type="dxa"/>
+              <w:left w:w="140" w:type="dxa"/>
+              <w:right w:w="140" w:type="dxa"/>
+            </w:tcMar>
+          </w:tcPr>
+          <w:p>
+            <w:pPr>
+              <w:spacing w:before="40" w:after="40"/>
+            </w:pPr>
+            <w:r>
+              <w:rPr>
+                <w:rFonts w:ascii="Calibri" w:hAnsi="Calibri"/>
+                <w:b/>
+                <w:color w:val="1E3A8A"/>
+                <w:sz w:val="20"/>
+              </w:rPr>
+              <w:t>UID</w:t>
+            </w:r>
+          </w:p>
+        </w:tc>
+        <w:tc>
+          <w:tcPr>
+            <w:tcW w:type="dxa" w:w="5760"/>
+            <w:shd w:fill="FFFFFF"/>
+            <w:tcMar>
+              <w:top w:w="90" w:type="dxa"/>
+              <w:bottom w:w="90" w:type="dxa"/>
+              <w:left w:w="140" w:type="dxa"/>
+              <w:right w:w="140" w:type="dxa"/>
+            </w:tcMar>
+          </w:tcPr>
+          <w:p>
+            <w:pPr>
+              <w:spacing w:before="40" w:after="40"/>
+            </w:pPr>
+            <w:r>
+              <w:rPr>
+                <w:rFonts w:ascii="Calibri" w:hAnsi="Calibri"/>
+                <w:b/>
+                <w:color w:val="0F172A"/>
+                <w:sz w:val="20"/>
+              </w:rPr>
+              <w:t>24BDA70369</w:t>
+            </w:r>
+          </w:p>
+        </w:tc>
+      </w:tr>
+      <w:tr>
+        <w:tc>
+          <w:tcPr>
+            <w:tcW w:type="dxa" w:w="3600"/>
+            <w:shd w:fill="F1F5F9"/>
+            <w:tcMar>
+              <w:top w:w="90" w:type="dxa"/>
+              <w:bottom w:w="90" w:type="dxa"/>
+              <w:left w:w="140" w:type="dxa"/>
+              <w:right w:w="140" w:type="dxa"/>
+            </w:tcMar>
+          </w:tcPr>
+          <w:p>
+            <w:pPr>
+              <w:spacing w:before="40" w:after="40"/>
+            </w:pPr>
+            <w:r>
+              <w:rPr>
+                <w:rFonts w:ascii="Calibri" w:hAnsi="Calibri"/>
+                <w:b/>
+                <w:color w:val="1E3A8A"/>
+                <w:sz w:val="20"/>
+              </w:rPr>
+              <w:t>Class / Section</w:t>
+            </w:r>
+          </w:p>
+        </w:tc>
+        <w:tc>
+          <w:tcPr>
+            <w:tcW w:type="dxa" w:w="5760"/>
+            <w:shd w:fill="FFFFFF"/>
+            <w:tcMar>
+              <w:top w:w="90" w:type="dxa"/>
+              <w:bottom w:w="90" w:type="dxa"/>
+              <w:left w:w="140" w:type="dxa"/>
+              <w:right w:w="140" w:type="dxa"/>
+            </w:tcMar>
+          </w:tcPr>
+          <w:p>
+            <w:pPr>
+              <w:spacing w:before="40" w:after="40"/>
+            </w:pPr>
+            <w:r>
+              <w:rPr>
+                <w:rFonts w:ascii="Calibri" w:hAnsi="Calibri"/>
+                <w:b/>
+                <w:color w:val="0F172A"/>
+                <w:sz w:val="20"/>
+              </w:rPr>
+              <w:t>24BDS 4NTPP</w:t>
+            </w:r>
+          </w:p>
+        </w:tc>
+      </w:tr>
+      <w:tr>
+        <w:tc>
+          <w:tcPr>
+            <w:tcW w:type="dxa" w:w="3600"/>
+            <w:shd w:fill="F1F5F9"/>
+            <w:tcMar>
+              <w:top w:w="90" w:type="dxa"/>
+              <w:bottom w:w="90" w:type="dxa"/>
+              <w:left w:w="140" w:type="dxa"/>
+              <w:right w:w="140" w:type="dxa"/>
+            </w:tcMar>
+          </w:tcPr>
+          <w:p>
+            <w:pPr>
+              <w:spacing w:before="40" w:after="40"/>
+            </w:pPr>
+            <w:r>
+              <w:rPr>
+                <w:rFonts w:ascii="Calibri" w:hAnsi="Calibri"/>
+                <w:b/>
+                <w:color w:val="1E3A8A"/>
+                <w:sz w:val="20"/>
+              </w:rPr>
+              <w:t>Course / Subject</w:t>
+            </w:r>
+          </w:p>
+        </w:tc>
+        <w:tc>
+          <w:tcPr>
+            <w:tcW w:type="dxa" w:w="5760"/>
+            <w:shd w:fill="FFFFFF"/>
+            <w:tcMar>
+              <w:top w:w="90" w:type="dxa"/>
+              <w:bottom w:w="90" w:type="dxa"/>
+              <w:left w:w="140" w:type="dxa"/>
+              <w:right w:w="140" w:type="dxa"/>
+            </w:tcMar>
+          </w:tcPr>
+          <w:p>
+            <w:pPr>
+              <w:spacing w:before="40" w:after="40"/>
+            </w:pPr>
+            <w:r>
+              <w:rPr>
+                <w:rFonts w:ascii="Calibri" w:hAnsi="Calibri"/>
+                <w:b/>
+                <w:color w:val="0F172A"/>
+                <w:sz w:val="20"/>
+              </w:rPr>
+              <w:t>Data Engineering II</w:t>
+            </w:r>
+          </w:p>
+        </w:tc>
+      </w:tr>
+      <w:tr>
+        <w:tc>
+          <w:tcPr>
+            <w:tcW w:type="dxa" w:w="3600"/>
+            <w:shd w:fill="F1F5F9"/>
+            <w:tcMar>
+              <w:top w:w="90" w:type="dxa"/>
+              <w:bottom w:w="90" w:type="dxa"/>
+              <w:left w:w="140" w:type="dxa"/>
+              <w:right w:w="140" w:type="dxa"/>
+            </w:tcMar>
+          </w:tcPr>
+          <w:p>
+            <w:pPr>
+              <w:spacing w:before="40" w:after="40"/>
+            </w:pPr>
+            <w:r>
+              <w:rPr>
+                <w:rFonts w:ascii="Calibri" w:hAnsi="Calibri"/>
+                <w:b/>
+                <w:color w:val="1E3A8A"/>
+                <w:sz w:val="20"/>
+              </w:rPr>
+              <w:t>Department</w:t>
+            </w:r>
+          </w:p>
+        </w:tc>
+        <w:tc>
+          <w:tcPr>
+            <w:tcW w:type="dxa" w:w="5760"/>
+            <w:shd w:fill="FFFFFF"/>
+            <w:tcMar>
+              <w:top w:w="90" w:type="dxa"/>
+              <w:bottom w:w="90" w:type="dxa"/>
+              <w:left w:w="140" w:type="dxa"/>
+              <w:right w:w="140" w:type="dxa"/>
+            </w:tcMar>
+          </w:tcPr>
+          <w:p>
+            <w:pPr>
+              <w:spacing w:before="40" w:after="40"/>
+            </w:pPr>
+            <w:r>
+              <w:rPr>
+                <w:rFonts w:ascii="Calibri" w:hAnsi="Calibri"/>
+                <w:b/>
+                <w:color w:val="0F172A"/>
+                <w:sz w:val="20"/>
+              </w:rPr>
+              <w:t>AIT - CSE Department</w:t>
+            </w:r>
+          </w:p>
+        </w:tc>
+      </w:tr>
+      <w:tr>
+        <w:tc>
+          <w:tcPr>
+            <w:tcW w:type="dxa" w:w="3600"/>
+            <w:shd w:fill="F1F5F9"/>
+            <w:tcMar>
+              <w:top w:w="90" w:type="dxa"/>
+              <w:bottom w:w="90" w:type="dxa"/>
+              <w:left w:w="140" w:type="dxa"/>
+              <w:right w:w="140" w:type="dxa"/>
+            </w:tcMar>
+          </w:tcPr>
+          <w:p>
+            <w:pPr>
+              <w:spacing w:before="40" w:after="40"/>
+            </w:pPr>
+            <w:r>
+              <w:rPr>
+                <w:rFonts w:ascii="Calibri" w:hAnsi="Calibri"/>
+                <w:b/>
+                <w:color w:val="1E3A8A"/>
+                <w:sz w:val="20"/>
+              </w:rPr>
+              <w:t>Faculty Evaluator / Mentor</w:t>
+            </w:r>
+          </w:p>
+        </w:tc>
+        <w:tc>
+          <w:tcPr>
+            <w:tcW w:type="dxa" w:w="5760"/>
+            <w:shd w:fill="FFFFFF"/>
+            <w:tcMar>
+              <w:top w:w="90" w:type="dxa"/>
+              <w:bottom w:w="90" w:type="dxa"/>
+              <w:left w:w="140" w:type="dxa"/>
+              <w:right w:w="140" w:type="dxa"/>
+            </w:tcMar>
+          </w:tcPr>
+          <w:p>
+            <w:pPr>
+              <w:spacing w:before="40" w:after="40"/>
+            </w:pPr>
+            <w:r>
+              <w:rPr>
+                <w:rFonts w:ascii="Calibri" w:hAnsi="Calibri"/>
+                <w:b/>
+                <w:color w:val="0F172A"/>
+                <w:sz w:val="20"/>
+              </w:rPr>
+              <w:t>Mr. Deepak Kumar</w:t>
+            </w:r>
+          </w:p>
+        </w:tc>
+      </w:tr>
+    </w:tbl>
     <w:p>
       <w:pPr>
-        <w:spacing w:after="280"/>
+        <w:spacing w:after="360"/>
       </w:pPr>
+    </w:p>
+    <w:p>
       <w:r>
-        <w:rPr>
-          <w:b/>
-          <w:color w:val="CBD5E1"/>
-        </w:rPr>
-        <w:t>――――――――――――――――――――――――――――――――――――――――――――――――――――――――――</w:t>
+        <w:br w:type="page"/>
       </w:r>
     </w:p>
     <w:p>
@@ -53,7 +420,403 @@
           <w:color w:val="2563EB"/>
           <w:sz w:val="26"/>
         </w:rPr>
-        <w:t>Project Metadata &amp; Quick Links</w:t>
+        <w:t>Academic &amp; Candidate Credentials</w:t>
+      </w:r>
+    </w:p>
+    <w:tbl>
+      <w:tblPr>
+        <w:tblW w:type="auto" w:w="0"/>
+        <w:jc w:val="center"/>
+        <w:tblLook w:firstColumn="1" w:firstRow="1" w:lastColumn="0" w:lastRow="0" w:noHBand="0" w:noVBand="1" w:val="04A0"/>
+      </w:tblPr>
+      <w:tblGrid>
+        <w:gridCol w:w="4680"/>
+        <w:gridCol w:w="4680"/>
+      </w:tblGrid>
+      <w:tr>
+        <w:tc>
+          <w:tcPr>
+            <w:tcW w:type="dxa" w:w="4680"/>
+            <w:shd w:fill="1E3A8A"/>
+            <w:tcMar>
+              <w:top w:w="120" w:type="dxa"/>
+              <w:bottom w:w="120" w:type="dxa"/>
+              <w:left w:w="140" w:type="dxa"/>
+              <w:right w:w="140" w:type="dxa"/>
+            </w:tcMar>
+          </w:tcPr>
+          <w:p>
+            <w:pPr>
+              <w:spacing w:before="40" w:after="40"/>
+            </w:pPr>
+            <w:r>
+              <w:rPr>
+                <w:rFonts w:ascii="Calibri" w:hAnsi="Calibri"/>
+                <w:b/>
+                <w:color w:val="FFFFFF"/>
+                <w:sz w:val="19"/>
+              </w:rPr>
+              <w:t>Parameter</w:t>
+            </w:r>
+          </w:p>
+        </w:tc>
+        <w:tc>
+          <w:tcPr>
+            <w:tcW w:type="dxa" w:w="4680"/>
+            <w:shd w:fill="1E3A8A"/>
+            <w:tcMar>
+              <w:top w:w="120" w:type="dxa"/>
+              <w:bottom w:w="120" w:type="dxa"/>
+              <w:left w:w="140" w:type="dxa"/>
+              <w:right w:w="140" w:type="dxa"/>
+            </w:tcMar>
+          </w:tcPr>
+          <w:p>
+            <w:pPr>
+              <w:spacing w:before="40" w:after="40"/>
+            </w:pPr>
+            <w:r>
+              <w:rPr>
+                <w:rFonts w:ascii="Calibri" w:hAnsi="Calibri"/>
+                <w:b/>
+                <w:color w:val="FFFFFF"/>
+                <w:sz w:val="19"/>
+              </w:rPr>
+              <w:t>Details</w:t>
+            </w:r>
+          </w:p>
+        </w:tc>
+      </w:tr>
+      <w:tr>
+        <w:tc>
+          <w:tcPr>
+            <w:tcW w:type="dxa" w:w="4680"/>
+            <w:shd w:fill="F8FAFC"/>
+            <w:tcMar>
+              <w:top w:w="80" w:type="dxa"/>
+              <w:bottom w:w="80" w:type="dxa"/>
+              <w:left w:w="120" w:type="dxa"/>
+              <w:right w:w="120" w:type="dxa"/>
+            </w:tcMar>
+          </w:tcPr>
+          <w:p>
+            <w:pPr>
+              <w:spacing w:before="40" w:after="40"/>
+            </w:pPr>
+            <w:r>
+              <w:rPr>
+                <w:rFonts w:ascii="Calibri" w:hAnsi="Calibri"/>
+                <w:color w:val="0F172A"/>
+                <w:sz w:val="18"/>
+              </w:rPr>
+              <w:t>**Student Name**</w:t>
+            </w:r>
+          </w:p>
+        </w:tc>
+        <w:tc>
+          <w:tcPr>
+            <w:tcW w:type="dxa" w:w="4680"/>
+            <w:shd w:fill="F8FAFC"/>
+            <w:tcMar>
+              <w:top w:w="80" w:type="dxa"/>
+              <w:bottom w:w="80" w:type="dxa"/>
+              <w:left w:w="120" w:type="dxa"/>
+              <w:right w:w="120" w:type="dxa"/>
+            </w:tcMar>
+          </w:tcPr>
+          <w:p>
+            <w:pPr>
+              <w:spacing w:before="40" w:after="40"/>
+            </w:pPr>
+            <w:r>
+              <w:rPr>
+                <w:rFonts w:ascii="Calibri" w:hAnsi="Calibri"/>
+                <w:color w:val="0F172A"/>
+                <w:sz w:val="18"/>
+              </w:rPr>
+              <w:t>**HIMANSHU GOYAL**</w:t>
+            </w:r>
+          </w:p>
+        </w:tc>
+      </w:tr>
+      <w:tr>
+        <w:tc>
+          <w:tcPr>
+            <w:tcW w:type="dxa" w:w="4680"/>
+            <w:shd w:fill="FFFFFF"/>
+            <w:tcMar>
+              <w:top w:w="80" w:type="dxa"/>
+              <w:bottom w:w="80" w:type="dxa"/>
+              <w:left w:w="120" w:type="dxa"/>
+              <w:right w:w="120" w:type="dxa"/>
+            </w:tcMar>
+          </w:tcPr>
+          <w:p>
+            <w:pPr>
+              <w:spacing w:before="40" w:after="40"/>
+            </w:pPr>
+            <w:r>
+              <w:rPr>
+                <w:rFonts w:ascii="Calibri" w:hAnsi="Calibri"/>
+                <w:color w:val="0F172A"/>
+                <w:sz w:val="18"/>
+              </w:rPr>
+              <w:t>**UID**</w:t>
+            </w:r>
+          </w:p>
+        </w:tc>
+        <w:tc>
+          <w:tcPr>
+            <w:tcW w:type="dxa" w:w="4680"/>
+            <w:shd w:fill="FFFFFF"/>
+            <w:tcMar>
+              <w:top w:w="80" w:type="dxa"/>
+              <w:bottom w:w="80" w:type="dxa"/>
+              <w:left w:w="120" w:type="dxa"/>
+              <w:right w:w="120" w:type="dxa"/>
+            </w:tcMar>
+          </w:tcPr>
+          <w:p>
+            <w:pPr>
+              <w:spacing w:before="40" w:after="40"/>
+            </w:pPr>
+            <w:r>
+              <w:rPr>
+                <w:rFonts w:ascii="Calibri" w:hAnsi="Calibri"/>
+                <w:color w:val="0F172A"/>
+                <w:sz w:val="18"/>
+              </w:rPr>
+              <w:t>**24BDA70369**</w:t>
+            </w:r>
+          </w:p>
+        </w:tc>
+      </w:tr>
+      <w:tr>
+        <w:tc>
+          <w:tcPr>
+            <w:tcW w:type="dxa" w:w="4680"/>
+            <w:shd w:fill="F8FAFC"/>
+            <w:tcMar>
+              <w:top w:w="80" w:type="dxa"/>
+              <w:bottom w:w="80" w:type="dxa"/>
+              <w:left w:w="120" w:type="dxa"/>
+              <w:right w:w="120" w:type="dxa"/>
+            </w:tcMar>
+          </w:tcPr>
+          <w:p>
+            <w:pPr>
+              <w:spacing w:before="40" w:after="40"/>
+            </w:pPr>
+            <w:r>
+              <w:rPr>
+                <w:rFonts w:ascii="Calibri" w:hAnsi="Calibri"/>
+                <w:color w:val="0F172A"/>
+                <w:sz w:val="18"/>
+              </w:rPr>
+              <w:t>**Section**</w:t>
+            </w:r>
+          </w:p>
+        </w:tc>
+        <w:tc>
+          <w:tcPr>
+            <w:tcW w:type="dxa" w:w="4680"/>
+            <w:shd w:fill="F8FAFC"/>
+            <w:tcMar>
+              <w:top w:w="80" w:type="dxa"/>
+              <w:bottom w:w="80" w:type="dxa"/>
+              <w:left w:w="120" w:type="dxa"/>
+              <w:right w:w="120" w:type="dxa"/>
+            </w:tcMar>
+          </w:tcPr>
+          <w:p>
+            <w:pPr>
+              <w:spacing w:before="40" w:after="40"/>
+            </w:pPr>
+            <w:r>
+              <w:rPr>
+                <w:rFonts w:ascii="Calibri" w:hAnsi="Calibri"/>
+                <w:color w:val="0F172A"/>
+                <w:sz w:val="18"/>
+              </w:rPr>
+              <w:t>**24BDS 4NTPP**</w:t>
+            </w:r>
+          </w:p>
+        </w:tc>
+      </w:tr>
+      <w:tr>
+        <w:tc>
+          <w:tcPr>
+            <w:tcW w:type="dxa" w:w="4680"/>
+            <w:shd w:fill="FFFFFF"/>
+            <w:tcMar>
+              <w:top w:w="80" w:type="dxa"/>
+              <w:bottom w:w="80" w:type="dxa"/>
+              <w:left w:w="120" w:type="dxa"/>
+              <w:right w:w="120" w:type="dxa"/>
+            </w:tcMar>
+          </w:tcPr>
+          <w:p>
+            <w:pPr>
+              <w:spacing w:before="40" w:after="40"/>
+            </w:pPr>
+            <w:r>
+              <w:rPr>
+                <w:rFonts w:ascii="Calibri" w:hAnsi="Calibri"/>
+                <w:color w:val="0F172A"/>
+                <w:sz w:val="18"/>
+              </w:rPr>
+              <w:t>**Course / Subject**</w:t>
+            </w:r>
+          </w:p>
+        </w:tc>
+        <w:tc>
+          <w:tcPr>
+            <w:tcW w:type="dxa" w:w="4680"/>
+            <w:shd w:fill="FFFFFF"/>
+            <w:tcMar>
+              <w:top w:w="80" w:type="dxa"/>
+              <w:bottom w:w="80" w:type="dxa"/>
+              <w:left w:w="120" w:type="dxa"/>
+              <w:right w:w="120" w:type="dxa"/>
+            </w:tcMar>
+          </w:tcPr>
+          <w:p>
+            <w:pPr>
+              <w:spacing w:before="40" w:after="40"/>
+            </w:pPr>
+            <w:r>
+              <w:rPr>
+                <w:rFonts w:ascii="Calibri" w:hAnsi="Calibri"/>
+                <w:color w:val="0F172A"/>
+                <w:sz w:val="18"/>
+              </w:rPr>
+              <w:t>**Data Engineering II**</w:t>
+            </w:r>
+          </w:p>
+        </w:tc>
+      </w:tr>
+      <w:tr>
+        <w:tc>
+          <w:tcPr>
+            <w:tcW w:type="dxa" w:w="4680"/>
+            <w:shd w:fill="F8FAFC"/>
+            <w:tcMar>
+              <w:top w:w="80" w:type="dxa"/>
+              <w:bottom w:w="80" w:type="dxa"/>
+              <w:left w:w="120" w:type="dxa"/>
+              <w:right w:w="120" w:type="dxa"/>
+            </w:tcMar>
+          </w:tcPr>
+          <w:p>
+            <w:pPr>
+              <w:spacing w:before="40" w:after="40"/>
+            </w:pPr>
+            <w:r>
+              <w:rPr>
+                <w:rFonts w:ascii="Calibri" w:hAnsi="Calibri"/>
+                <w:color w:val="0F172A"/>
+                <w:sz w:val="18"/>
+              </w:rPr>
+              <w:t>**Department**</w:t>
+            </w:r>
+          </w:p>
+        </w:tc>
+        <w:tc>
+          <w:tcPr>
+            <w:tcW w:type="dxa" w:w="4680"/>
+            <w:shd w:fill="F8FAFC"/>
+            <w:tcMar>
+              <w:top w:w="80" w:type="dxa"/>
+              <w:bottom w:w="80" w:type="dxa"/>
+              <w:left w:w="120" w:type="dxa"/>
+              <w:right w:w="120" w:type="dxa"/>
+            </w:tcMar>
+          </w:tcPr>
+          <w:p>
+            <w:pPr>
+              <w:spacing w:before="40" w:after="40"/>
+            </w:pPr>
+            <w:r>
+              <w:rPr>
+                <w:rFonts w:ascii="Calibri" w:hAnsi="Calibri"/>
+                <w:color w:val="0F172A"/>
+                <w:sz w:val="18"/>
+              </w:rPr>
+              <w:t>**AIT - CSE Department**</w:t>
+            </w:r>
+          </w:p>
+        </w:tc>
+      </w:tr>
+      <w:tr>
+        <w:tc>
+          <w:tcPr>
+            <w:tcW w:type="dxa" w:w="4680"/>
+            <w:shd w:fill="FFFFFF"/>
+            <w:tcMar>
+              <w:top w:w="80" w:type="dxa"/>
+              <w:bottom w:w="80" w:type="dxa"/>
+              <w:left w:w="120" w:type="dxa"/>
+              <w:right w:w="120" w:type="dxa"/>
+            </w:tcMar>
+          </w:tcPr>
+          <w:p>
+            <w:pPr>
+              <w:spacing w:before="40" w:after="40"/>
+            </w:pPr>
+            <w:r>
+              <w:rPr>
+                <w:rFonts w:ascii="Calibri" w:hAnsi="Calibri"/>
+                <w:color w:val="0F172A"/>
+                <w:sz w:val="18"/>
+              </w:rPr>
+              <w:t>**Faculty Evaluator**</w:t>
+            </w:r>
+          </w:p>
+        </w:tc>
+        <w:tc>
+          <w:tcPr>
+            <w:tcW w:type="dxa" w:w="4680"/>
+            <w:shd w:fill="FFFFFF"/>
+            <w:tcMar>
+              <w:top w:w="80" w:type="dxa"/>
+              <w:bottom w:w="80" w:type="dxa"/>
+              <w:left w:w="120" w:type="dxa"/>
+              <w:right w:w="120" w:type="dxa"/>
+            </w:tcMar>
+          </w:tcPr>
+          <w:p>
+            <w:pPr>
+              <w:spacing w:before="40" w:after="40"/>
+            </w:pPr>
+            <w:r>
+              <w:rPr>
+                <w:rFonts w:ascii="Calibri" w:hAnsi="Calibri"/>
+                <w:color w:val="0F172A"/>
+                <w:sz w:val="18"/>
+              </w:rPr>
+              <w:t>**Mr. Deepak Kumar**</w:t>
+            </w:r>
+          </w:p>
+        </w:tc>
+      </w:tr>
+    </w:tbl>
+    <w:p>
+      <w:pPr>
+        <w:spacing w:after="120"/>
+      </w:pPr>
+    </w:p>
+    <w:p>
+      <w:pPr>
+        <w:spacing w:before="200" w:after="60"/>
+      </w:pPr>
+      <w:r>
+        <w:rPr>
+          <w:rFonts w:ascii="Calibri" w:hAnsi="Calibri"/>
+          <w:b/>
+          <w:color w:val="2563EB"/>
+          <w:sz w:val="26"/>
+        </w:rPr>
+        <w:t>Project Links &amp; Specifications</w:t>
       </w:r>
     </w:p>
     <w:p>

</xml_diff>